<commit_message>
Complete final version of the project Microservice
</commit_message>
<xml_diff>
--- a/HUONG_DAN_CHAY_DEMO_MICROSERVICES_K8S.docx
+++ b/HUONG_DAN_CHAY_DEMO_MICROSERVICES_K8S.docx
@@ -717,6 +717,75 @@
               <w:t>Metrics: Prometheus raw data</w:t>
             </w:r>
           </w:p>
+        </w:tc>
+      </w:tr>
+      <w:tr>
+        <w:tc>
+          <w:p>
+            <w:r>
+              <w:rPr>
+                <w:rFonts w:ascii="Segoe UI" w:hAnsi="Segoe UI"/>
+                <w:sz w:val="19"/>
+              </w:rPr>
+              <w:t>7. Quản lý &amp; Duyệt đơn hàng (Admin)</w:t>
+            </w:r>
+          </w:p>
+          <w:tcPr>
+            <w:tcW w:w="2592" w:type="dxa"/>
+            <w:shd w:val="clear" w:color="auto" w:fill="FFFFFF"/>
+            <w:tcMar>
+              <w:top w:w="80" w:type="dxa"/>
+              <w:left w:w="120" w:type="dxa"/>
+              <w:bottom w:w="80" w:type="dxa"/>
+              <w:right w:w="120" w:type="dxa"/>
+            </w:tcMar>
+          </w:tcPr>
+        </w:tc>
+        <w:tc>
+          <w:p>
+            <w:r>
+              <w:rPr>
+                <w:rFonts w:ascii="Segoe UI" w:hAnsi="Segoe UI"/>
+                <w:sz w:val="19"/>
+              </w:rPr>
+              <w:t>http://localhost:30080</w:t>
+            </w:r>
+          </w:p>
+          <w:tcPr>
+            <w:tcW w:w="3600" w:type="dxa"/>
+            <w:shd w:val="clear" w:color="auto" w:fill="FFFFFF"/>
+            <w:tcMar>
+              <w:top w:w="80" w:type="dxa"/>
+              <w:left w:w="120" w:type="dxa"/>
+              <w:bottom w:w="80" w:type="dxa"/>
+              <w:right w:w="120" w:type="dxa"/>
+            </w:tcMar>
+          </w:tcPr>
+        </w:tc>
+        <w:tc>
+          <w:p>
+            <w:r>
+              <w:rPr>
+                <w:rFonts w:ascii="Segoe UI" w:hAnsi="Segoe UI"/>
+                <w:sz w:val="19"/>
+              </w:rPr>
+              <w:t>Tài khoản Admin: admin@blanc.vn / admin123</w:t>
+              <w:br/>
+              <w:t>(Hoặc bấm '👑 Đăng Nhập Nhanh Quyền Admin')</w:t>
+              <w:br/>
+              <w:t>Bấm nút '📋 Quản Lý Đơn Hàng' để xem đơn khách vừa đặt, bấm Duyệt đơn để kích hoạt Worker xử lý ngầm qua Redis.</w:t>
+            </w:r>
+          </w:p>
+          <w:tcPr>
+            <w:tcW w:w="3168" w:type="dxa"/>
+            <w:shd w:val="clear" w:color="auto" w:fill="FFFFFF"/>
+            <w:tcMar>
+              <w:top w:w="80" w:type="dxa"/>
+              <w:left w:w="120" w:type="dxa"/>
+              <w:bottom w:w="80" w:type="dxa"/>
+              <w:right w:w="120" w:type="dxa"/>
+            </w:tcMar>
+          </w:tcPr>
         </w:tc>
       </w:tr>
     </w:tbl>
@@ -1506,6 +1575,94 @@
       </w:tr>
     </w:tbl>
     <w:p>
+      <w:pPr/>
+      <w:r>
+        <w:rPr>
+          <w:rFonts w:ascii="Segoe UI" w:hAnsi="Segoe UI"/>
+          <w:b/>
+          <w:color w:val="0F766E"/>
+        </w:rPr>
+        <w:t>BƯỚC 5: Demo Quy Trình Đặt Hàng &amp; Quản Trị Duyệt Đơn (Event-Driven Worker)</w:t>
+      </w:r>
+    </w:p>
+    <w:tbl>
+      <w:tblGrid>
+        <w:gridCol w:w="9936"/>
+      </w:tblGrid>
+      <w:tr>
+        <w:tc>
+          <w:p>
+            <w:r>
+              <w:rPr>
+                <w:rFonts w:ascii="Consolas" w:hAnsi="Consolas"/>
+                <w:color w:val="1E293B"/>
+                <w:sz w:val="18"/>
+              </w:rPr>
+              <w:t># Mở 1 cửa sổ PowerShell mới để theo dõi log Worker Service chạy nền:</w:t>
+              <w:br/>
+              <w:t>kubectl logs -l app=worker -f</w:t>
+              <w:br/>
+              <w:br/>
+              <w:t># Các bước thực hiện Demo trực tiếp trên Trình duyệt:</w:t>
+              <w:br/>
+              <w:t>1. Mở http://localhost:30080 trên 1 tab ẩn danh (đóng vai Khách Hàng):</w:t>
+              <w:br/>
+              <w:t xml:space="preserve">   - Chọn 1 món đồ nội thất (ví dụ: Sofa Modular Blanc Soft L-Shape 16.800.000₫).</w:t>
+              <w:br/>
+              <w:t xml:space="preserve">   - Bấm 'Thêm Vào Giỏ' -&gt; Mở Giỏ hàng -&gt; Bấm 'Tiến Hành Đặt Hàng'.</w:t>
+              <w:br/>
+              <w:t xml:space="preserve">   - Nhập tên, số điện thoại, địa chỉ nhận hàng -&gt; Bấm 'Xác Nhận Đặt Hàng Ngay'.</w:t>
+              <w:br/>
+              <w:t xml:space="preserve">   - Đơn hàng được tạo thành công với mã BLC-xxxx (Trạng thái ban đầu: 'Đang chuẩn bị hàng').</w:t>
+              <w:br/>
+              <w:br/>
+              <w:t>2. Mở http://localhost:30080 trên 1 tab bình thường (đóng vai Quản Trị Viên Admin):</w:t>
+              <w:br/>
+              <w:t xml:space="preserve">   - Bấm biểu tượng 'Tài khoản' -&gt; Nhập admin@blanc.vn / admin123 (hoặc bấm '👑 Đăng Nhập Nhanh Quyền Admin').</w:t>
+              <w:br/>
+              <w:t xml:space="preserve">   - Trên thanh công cụ Showroom xuất hiện nút '📋 Quản Lý Đơn Hàng' kèm badge số đơn chờ duyệt màu cam.</w:t>
+              <w:br/>
+              <w:t xml:space="preserve">   - Bấm vào nút '📋 Quản Lý Đơn Hàng' để mở bảng thống kê doanh thu &amp; danh sách đơn khách vừa đặt.</w:t>
+              <w:br/>
+              <w:br/>
+              <w:t>3. Thực hiện Duyệt Đơn Hàng:</w:t>
+              <w:br/>
+              <w:t xml:space="preserve">   - Admin bấm nút xanh '[Duyệt Đơn Hàng]'.</w:t>
+              <w:br/>
+              <w:t xml:space="preserve">   - Quan sát Terminal Worker: Ngay lập tức xuất hiện dòng log xử lý bất đồng bộ từ Redis queue:</w:t>
+              <w:br/>
+              <w:t xml:space="preserve">     [Worker] Bắt đầu xử lý tác vụ: [update_order_status] với dữ liệu: {'order_id': ..., 'status': 'Đã duyệt - Đang chuẩn bị giao'}</w:t>
+              <w:br/>
+              <w:t xml:space="preserve">     [Worker] -&gt; Cập nhật trạng thái đơn hàng #... thành 'Đã duyệt - Đang chuẩn bị giao'</w:t>
+              <w:br/>
+              <w:t xml:space="preserve">     [Worker] -&gt; Đã cập nhật database cho đơn hàng #...</w:t>
+              <w:br/>
+              <w:t xml:space="preserve">   - Trạng thái đơn hàng của khách hàng lập tức chuyển sang màu xanh: 'Đã duyệt / Đang giao hàng'.</w:t>
+            </w:r>
+          </w:p>
+          <w:tcPr>
+            <w:tcW w:w="9360" w:type="dxa"/>
+            <w:tcBorders>
+              <w:left w:val="single" w:sz="24" w:space="0" w:color="0284C7"/>
+            </w:tcBorders>
+            <w:shd w:val="clear" w:color="auto" w:fill="F1F5F9"/>
+            <w:tcMar>
+              <w:top w:w="120" w:type="dxa"/>
+              <w:left w:w="200" w:type="dxa"/>
+              <w:bottom w:w="120" w:type="dxa"/>
+              <w:right w:w="200" w:type="dxa"/>
+            </w:tcMar>
+          </w:tcPr>
+        </w:tc>
+      </w:tr>
+      <w:tblPr>
+        <w:tblW w:w="0" w:type="auto"/>
+        <w:jc w:val="center"/>
+        <w:tblLayout w:type="fixed"/>
+        <w:tblLook w:val="04A0" w:firstRow="1" w:lastRow="0" w:firstColumn="1" w:lastColumn="0" w:noHBand="0" w:noVBand="1"/>
+      </w:tblPr>
+    </w:tbl>
+    <w:p>
       <w:pPr>
         <w:spacing w:after="120"/>
       </w:pPr>
@@ -2778,6 +2935,94 @@
               <w:t>Hệ thống cảnh báo tự động Alertmanager tiếp nhận và phân phối sự cố tức thì đến quản trị viên.</w:t>
             </w:r>
           </w:p>
+        </w:tc>
+      </w:tr>
+      <w:tr>
+        <w:tc>
+          <w:p>
+            <w:r>
+              <w:rPr>
+                <w:rFonts w:ascii="Segoe UI" w:hAnsi="Segoe UI"/>
+                <w:sz w:val="19"/>
+              </w:rPr>
+              <w:t>11. Xử lý nền &amp; Hướng sự kiện (Event-Driven Worker)</w:t>
+            </w:r>
+          </w:p>
+          <w:tcPr>
+            <w:tcW w:w="2016" w:type="dxa"/>
+            <w:shd w:val="clear" w:color="auto" w:fill="FFFFFF"/>
+            <w:tcMar>
+              <w:top w:w="80" w:type="dxa"/>
+              <w:left w:w="100" w:type="dxa"/>
+              <w:bottom w:w="80" w:type="dxa"/>
+              <w:right w:w="100" w:type="dxa"/>
+            </w:tcMar>
+          </w:tcPr>
+        </w:tc>
+        <w:tc>
+          <w:p>
+            <w:r>
+              <w:rPr>
+                <w:rFonts w:ascii="Segoe UI" w:hAnsi="Segoe UI"/>
+                <w:sz w:val="19"/>
+              </w:rPr>
+              <w:t>Mở Web http://localhost:30080</w:t>
+              <w:br/>
+              <w:t>Terminal: kubectl logs -l app=worker -f</w:t>
+            </w:r>
+          </w:p>
+          <w:tcPr>
+            <w:tcW w:w="2880" w:type="dxa"/>
+            <w:shd w:val="clear" w:color="auto" w:fill="FFFFFF"/>
+            <w:tcMar>
+              <w:top w:w="80" w:type="dxa"/>
+              <w:left w:w="100" w:type="dxa"/>
+              <w:bottom w:w="80" w:type="dxa"/>
+              <w:right w:w="100" w:type="dxa"/>
+            </w:tcMar>
+          </w:tcPr>
+        </w:tc>
+        <w:tc>
+          <w:p>
+            <w:r>
+              <w:rPr>
+                <w:rFonts w:ascii="Segoe UI" w:hAnsi="Segoe UI"/>
+                <w:sz w:val="19"/>
+              </w:rPr>
+              <w:t>Khách đặt hàng hoặc Admin bấm Duyệt đơn -&gt; Worker Service lập tức nhận job từ Redis Queue và cập nhật DB ngầm không gây nghẽn API.</w:t>
+            </w:r>
+          </w:p>
+          <w:tcPr>
+            <w:tcW w:w="2592" w:type="dxa"/>
+            <w:shd w:val="clear" w:color="auto" w:fill="FFFFFF"/>
+            <w:tcMar>
+              <w:top w:w="80" w:type="dxa"/>
+              <w:left w:w="100" w:type="dxa"/>
+              <w:bottom w:w="80" w:type="dxa"/>
+              <w:right w:w="100" w:type="dxa"/>
+            </w:tcMar>
+          </w:tcPr>
+        </w:tc>
+        <w:tc>
+          <w:p>
+            <w:r>
+              <w:rPr>
+                <w:rFonts w:ascii="Segoe UI" w:hAnsi="Segoe UI"/>
+                <w:sz w:val="19"/>
+              </w:rPr>
+              <w:t>Minh chứng kiến trúc Message Queue bất đồng bộ (Redis Broker + Worker Consumer): Phân tách tải xử lý nặng khỏi Backend API, tăng tính sẵn sàng và khả năng chịu tải của hệ thống.</w:t>
+            </w:r>
+          </w:p>
+          <w:tcPr>
+            <w:tcW w:w="2592" w:type="dxa"/>
+            <w:shd w:val="clear" w:color="auto" w:fill="FFFFFF"/>
+            <w:tcMar>
+              <w:top w:w="80" w:type="dxa"/>
+              <w:left w:w="100" w:type="dxa"/>
+              <w:bottom w:w="80" w:type="dxa"/>
+              <w:right w:w="100" w:type="dxa"/>
+            </w:tcMar>
+          </w:tcPr>
         </w:tc>
       </w:tr>
     </w:tbl>

</xml_diff>